<commit_message>
Sladit prezentaci kapitoly 4 s novou simulací těžších chvostů
Snímek 30 má nový obrázek (původní styl, nová data) a v poznámkách
exces 3,23 a nové percentily. DOCX poznámek upraven jen v týchž
větách, PDF znovu exportováno z PowerPointu. Nahrávka kapitoly 4
zůstává s původními čísly.

Co-Authored-By: Claude Opus 5.5 <noreply@anthropic.com>
</commit_message>
<xml_diff>
--- a/presentations/kapitola_04_poznamky.docx
+++ b/presentations/kapitola_04_poznamky.docx
@@ -4149,7 +4149,7 @@
       </w:r>
       <w:r>
         <w:rPr/>
-        <w:t xml:space="preserve"> a kladným excesem (zde 5,01) nazýváme </w:t>
+        <w:t xml:space="preserve"> a kladným excesem (zde 3,23) nazýváme </w:t>
       </w:r>
       <w:r>
         <w:rPr>
@@ -4173,7 +4173,7 @@
       </w:pPr>
       <w:r>
         <w:rPr/>
-        <w:t xml:space="preserve">Model by podcenil krajní výsledky: 99. percentil 79,9 bodu místo 88,6. Kvartily by naopak umístil dál od středu (39,5 a 57,6 místo 42,1 a 55,1), protože většina hodnot leží blíž středu.</w:t>
+        <w:t xml:space="preserve">Model by na obou koncích podcenil krajní výsledky: 1. percentil 22,0 bodu místo 15,1 a 99. percentil 79,9 bodu místo 87,8. Kvartily by naopak umístil dál od středu (42,5 a 59,3 místo 45,4 a 56,6), protože většina hodnot leží blíž středu.</w:t>
       </w:r>
     </w:p>
     <w:p>

</xml_diff>